<commit_message>
A1.2 Getting Around complete: ten units, 150 figures, answer key
The Prairie Line, Toronto to Vancouver. 223 pp. Every answer-bearing
block shuffled, every key checked against the shuffled text (0 problems),
true/false sets balanced.

Renderer fixes this book needed, which also improve the earlier books:
elision notes and weight-figure notes now wrap instead of running off the
plate, and overlapping bars in a synthesis figure keep their labels apart.

Co-Authored-By: Claude Opus 5 <noreply@anthropic.com>
Claude-Session: https://claude.ai/code/session_014CXxgwgFGq3U1n3hdRyQYX
</commit_message>
<xml_diff>
--- a/docs/english-animated/build/a11-unit02/EnglishAnimated_A11_Unit02.docx
+++ b/docs/english-animated/build/a11-unit02/EnglishAnimated_A11_Unit02.docx
@@ -1028,7 +1028,7 @@
         <w:pStyle w:val="BlockText"/>
       </w:pPr>
       <w:r>
-        <w:t xml:space="preserve">wash · tired · eat · hungry · sleep · happy · drink · thirsty · work · study</w:t>
+        <w:t xml:space="preserve">sleep · drink · happy · tired · wash · hungry · work · study · eat · thirsty</w:t>
       </w:r>
     </w:p>
     <w:tbl>
@@ -5179,7 +5179,7 @@
         <w:pStyle w:val="Compact"/>
       </w:pPr>
       <w:r>
-        <w:t xml:space="preserve">______ six o'clock</w:t>
+        <w:t xml:space="preserve">______ night</w:t>
       </w:r>
     </w:p>
     <w:p>
@@ -5203,7 +5203,7 @@
         <w:pStyle w:val="Compact"/>
       </w:pPr>
       <w:r>
-        <w:t xml:space="preserve">______ the morning</w:t>
+        <w:t xml:space="preserve">______ Saturday afternoon</w:t>
       </w:r>
     </w:p>
     <w:p>
@@ -5215,7 +5215,7 @@
         <w:pStyle w:val="Compact"/>
       </w:pPr>
       <w:r>
-        <w:t xml:space="preserve">______ night</w:t>
+        <w:t xml:space="preserve">______ six o'clock</w:t>
       </w:r>
     </w:p>
     <w:p>
@@ -5227,7 +5227,7 @@
         <w:pStyle w:val="Compact"/>
       </w:pPr>
       <w:r>
-        <w:t xml:space="preserve">______ Saturday afternoon</w:t>
+        <w:t xml:space="preserve">______ the morning</w:t>
       </w:r>
     </w:p>
     <w:p>

</xml_diff>